<commit_message>
conflicto en la exportacion word solucionado
</commit_message>
<xml_diff>
--- a/_test_april.docx
+++ b/_test_april.docx
@@ -666,8 +666,8 @@
       </w:r>
       <w:r>
         <w:rPr>
+          <w:rFonts w:ascii="Arial" w:hAnsi="Arial" w:cs="Arial"/>
           <w:b/>
-          <w:rFonts w:ascii="Arial" w:hAnsi="Arial" w:cs="Arial"/>
         </w:rPr>
         <w:t xml:space="preserve">1st April to 30th 2026</w:t>
       </w:r>
@@ -679,8 +679,8 @@
       </w:r>
       <w:r>
         <w:rPr>
+          <w:rFonts w:ascii="Arial" w:hAnsi="Arial" w:cs="Arial"/>
           <w:b/>
-          <w:rFonts w:ascii="Arial" w:hAnsi="Arial" w:cs="Arial"/>
         </w:rPr>
         <w:t xml:space="preserve">-0,17%</w:t>
       </w:r>
@@ -1602,8 +1602,8 @@
       </w:r>
       <w:r>
         <w:rPr>
+          <w:rFonts w:ascii="Arial" w:hAnsi="Arial" w:cs="Arial"/>
           <w:b/>
-          <w:rFonts w:ascii="Arial" w:hAnsi="Arial" w:cs="Arial"/>
         </w:rPr>
         <w:t xml:space="preserve">77 deliveries of these are below the -0,50% threshold.</w:t>
       </w:r>
@@ -1648,8 +1648,8 @@
       </w:r>
       <w:r>
         <w:rPr>
+          <w:rFonts w:ascii="Arial" w:hAnsi="Arial" w:cs="Arial"/>
           <w:b/>
-          <w:rFonts w:ascii="Arial" w:hAnsi="Arial" w:cs="Arial"/>
         </w:rPr>
         <w:t xml:space="preserve">-1,0%</w:t>
       </w:r>
@@ -1661,8 +1661,8 @@
       </w:r>
       <w:r>
         <w:rPr>
+          <w:rFonts w:ascii="Arial" w:hAnsi="Arial" w:cs="Arial"/>
           <w:b/>
-          <w:rFonts w:ascii="Arial" w:hAnsi="Arial" w:cs="Arial"/>
         </w:rPr>
         <w:t xml:space="preserve">0%</w:t>
       </w:r>
@@ -1810,8 +1810,8 @@
       </w:r>
       <w:r>
         <w:rPr>
+          <w:rFonts w:ascii="Arial" w:hAnsi="Arial" w:cs="Arial"/>
           <w:b/>
-          <w:rFonts w:ascii="Arial" w:hAnsi="Arial" w:cs="Arial"/>
         </w:rPr>
         <w:t xml:space="preserve">-0,43%</w:t>
       </w:r>
@@ -1823,8 +1823,8 @@
       </w:r>
       <w:r>
         <w:rPr>
+          <w:rFonts w:ascii="Arial" w:hAnsi="Arial" w:cs="Arial"/>
           <w:b/>
-          <w:rFonts w:ascii="Arial" w:hAnsi="Arial" w:cs="Arial"/>
         </w:rPr>
         <w:t xml:space="preserve">-0,68%</w:t>
       </w:r>
@@ -1836,8 +1836,8 @@
       </w:r>
       <w:r>
         <w:rPr>
+          <w:rFonts w:ascii="Arial" w:hAnsi="Arial" w:cs="Arial"/>
           <w:b/>
-          <w:rFonts w:ascii="Arial" w:hAnsi="Arial" w:cs="Arial"/>
         </w:rPr>
         <w:t xml:space="preserve">0,21%</w:t>
       </w:r>
@@ -1849,15 +1849,15 @@
       </w:r>
       <w:r>
         <w:rPr>
+          <w:rFonts w:ascii="Arial" w:hAnsi="Arial" w:cs="Arial"/>
           <w:b/>
-          <w:rFonts w:ascii="Arial" w:hAnsi="Arial" w:cs="Arial"/>
         </w:rPr>
         <w:t xml:space="preserve">142.115</w:t>
       </w:r>
       <w:r>
         <w:rPr>
+          <w:rFonts w:ascii="Arial" w:hAnsi="Arial" w:cs="Arial"/>
           <w:b/>
-          <w:rFonts w:ascii="Arial" w:hAnsi="Arial" w:cs="Arial"/>
         </w:rPr>
         <w:t xml:space="preserve"> liters</w:t>
       </w:r>
@@ -2024,11 +2024,6 @@
                 <w:sz w:val="20"/>
                 <w:szCs w:val="20"/>
                 <w:lang w:eastAsia="es-CO"/>
-                <w14:textOutline w14:w="9525" w14:cap="rnd" w14:cmpd="sng" w14:algn="ctr">
-                  <w14:noFill/>
-                  <w14:prstDash w14:val="solid"/>
-                  <w14:bevel/>
-                </w14:textOutline>
               </w:rPr>
             </w:pPr>
           </w:p>
@@ -2058,11 +2053,6 @@
                 <w:sz w:val="20"/>
                 <w:szCs w:val="20"/>
                 <w:lang w:val="es-CO" w:eastAsia="es-CO"/>
-                <w14:textOutline w14:w="9525" w14:cap="rnd" w14:cmpd="sng" w14:algn="ctr">
-                  <w14:noFill/>
-                  <w14:prstDash w14:val="solid"/>
-                  <w14:bevel/>
-                </w14:textOutline>
               </w:rPr>
             </w:pPr>
             <w:r>
@@ -2074,11 +2064,6 @@
                 <w:sz w:val="20"/>
                 <w:szCs w:val="20"/>
                 <w:lang w:val="es-CO" w:eastAsia="es-CO"/>
-                <w14:textOutline w14:w="9525" w14:cap="rnd" w14:cmpd="sng" w14:algn="ctr">
-                  <w14:noFill/>
-                  <w14:prstDash w14:val="solid"/>
-                  <w14:bevel/>
-                </w14:textOutline>
               </w:rPr>
               <w:t>Delivery Tickets</w:t>
             </w:r>
@@ -2109,11 +2094,6 @@
                 <w:sz w:val="20"/>
                 <w:szCs w:val="20"/>
                 <w:lang w:val="es-CO" w:eastAsia="es-CO"/>
-                <w14:textOutline w14:w="9525" w14:cap="rnd" w14:cmpd="sng" w14:algn="ctr">
-                  <w14:noFill/>
-                  <w14:prstDash w14:val="solid"/>
-                  <w14:bevel/>
-                </w14:textOutline>
               </w:rPr>
             </w:pPr>
             <w:r>
@@ -2125,11 +2105,6 @@
                 <w:sz w:val="20"/>
                 <w:szCs w:val="20"/>
                 <w:lang w:val="es-CO" w:eastAsia="es-CO"/>
-                <w14:textOutline w14:w="9525" w14:cap="rnd" w14:cmpd="sng" w14:algn="ctr">
-                  <w14:noFill/>
-                  <w14:prstDash w14:val="solid"/>
-                  <w14:bevel/>
-                </w14:textOutline>
               </w:rPr>
               <w:t>Inlet Deliveries</w:t>
             </w:r>
@@ -2160,11 +2135,6 @@
                 <w:sz w:val="20"/>
                 <w:szCs w:val="20"/>
                 <w:lang w:val="es-CO" w:eastAsia="es-CO"/>
-                <w14:textOutline w14:w="9525" w14:cap="rnd" w14:cmpd="sng" w14:algn="ctr">
-                  <w14:noFill/>
-                  <w14:prstDash w14:val="solid"/>
-                  <w14:bevel/>
-                </w14:textOutline>
               </w:rPr>
             </w:pPr>
             <w:r>
@@ -2176,11 +2146,6 @@
                 <w:sz w:val="20"/>
                 <w:szCs w:val="20"/>
                 <w:lang w:val="es-CO" w:eastAsia="es-CO"/>
-                <w14:textOutline w14:w="9525" w14:cap="rnd" w14:cmpd="sng" w14:algn="ctr">
-                  <w14:noFill/>
-                  <w14:prstDash w14:val="solid"/>
-                  <w14:bevel/>
-                </w14:textOutline>
               </w:rPr>
               <w:t>Sum of Variance</w:t>
             </w:r>
@@ -2211,11 +2176,6 @@
                 <w:sz w:val="20"/>
                 <w:szCs w:val="20"/>
                 <w:lang w:val="es-CO" w:eastAsia="es-CO"/>
-                <w14:textOutline w14:w="9525" w14:cap="rnd" w14:cmpd="sng" w14:algn="ctr">
-                  <w14:noFill/>
-                  <w14:prstDash w14:val="solid"/>
-                  <w14:bevel/>
-                </w14:textOutline>
               </w:rPr>
             </w:pPr>
             <w:r>
@@ -2227,11 +2187,6 @@
                 <w:sz w:val="20"/>
                 <w:szCs w:val="20"/>
                 <w:lang w:val="es-CO" w:eastAsia="es-CO"/>
-                <w14:textOutline w14:w="9525" w14:cap="rnd" w14:cmpd="sng" w14:algn="ctr">
-                  <w14:noFill/>
-                  <w14:prstDash w14:val="solid"/>
-                  <w14:bevel/>
-                </w14:textOutline>
               </w:rPr>
               <w:t>Variance %</w:t>
             </w:r>
@@ -6168,8 +6123,8 @@
       </w:r>
       <w:r>
         <w:rPr>
+          <w:rFonts w:ascii="Arial" w:hAnsi="Arial" w:cs="Arial"/>
           <w:b/>
-          <w:rFonts w:ascii="Arial" w:hAnsi="Arial" w:cs="Arial"/>
         </w:rPr>
         <w:t xml:space="preserve">Transactions</w:t>
       </w:r>
@@ -6181,15 +6136,15 @@
       </w:r>
       <w:r>
         <w:rPr>
+          <w:rFonts w:ascii="Arial" w:hAnsi="Arial" w:cs="Arial"/>
           <w:b/>
-          <w:rFonts w:ascii="Arial" w:hAnsi="Arial" w:cs="Arial"/>
         </w:rPr>
         <w:t xml:space="preserve">4.214.579</w:t>
       </w:r>
       <w:r>
         <w:rPr>
+          <w:rFonts w:ascii="Arial" w:hAnsi="Arial" w:cs="Arial"/>
           <w:b/>
-          <w:rFonts w:ascii="Arial" w:hAnsi="Arial" w:cs="Arial"/>
         </w:rPr>
         <w:t xml:space="preserve"> L</w:t>
       </w:r>
@@ -6235,22 +6190,22 @@
       </w:r>
       <w:r>
         <w:rPr>
+          <w:rFonts w:ascii="Arial" w:hAnsi="Arial" w:cs="Arial"/>
           <w:b/>
-          <w:rFonts w:ascii="Arial" w:hAnsi="Arial" w:cs="Arial"/>
         </w:rPr>
         <w:t xml:space="preserve">Dispensing to Equipment: </w:t>
       </w:r>
       <w:r>
         <w:rPr>
+          <w:rFonts w:ascii="Arial" w:hAnsi="Arial" w:cs="Arial"/>
           <w:b/>
-          <w:rFonts w:ascii="Arial" w:hAnsi="Arial" w:cs="Arial"/>
         </w:rPr>
         <w:t xml:space="preserve">2.600.625</w:t>
       </w:r>
       <w:r>
         <w:rPr>
+          <w:rFonts w:ascii="Arial" w:hAnsi="Arial" w:cs="Arial"/>
           <w:b/>
-          <w:rFonts w:ascii="Arial" w:hAnsi="Arial" w:cs="Arial"/>
         </w:rPr>
         <w:t xml:space="preserve"> L</w:t>
       </w:r>
@@ -6286,22 +6241,22 @@
       </w:r>
       <w:r>
         <w:rPr>
+          <w:rFonts w:ascii="Arial" w:hAnsi="Arial" w:cs="Arial"/>
           <w:b/>
-          <w:rFonts w:ascii="Arial" w:hAnsi="Arial" w:cs="Arial"/>
         </w:rPr>
         <w:t xml:space="preserve">Dispensing to other equipment </w:t>
       </w:r>
       <w:r>
         <w:rPr>
+          <w:rFonts w:ascii="Arial" w:hAnsi="Arial" w:cs="Arial"/>
           <w:b/>
-          <w:rFonts w:ascii="Arial" w:hAnsi="Arial" w:cs="Arial"/>
         </w:rPr>
         <w:t xml:space="preserve">0</w:t>
       </w:r>
       <w:r>
         <w:rPr>
+          <w:rFonts w:ascii="Arial" w:hAnsi="Arial" w:cs="Arial"/>
           <w:b/>
-          <w:rFonts w:ascii="Arial" w:hAnsi="Arial" w:cs="Arial"/>
         </w:rPr>
         <w:t xml:space="preserve"> L</w:t>
       </w:r>
@@ -6339,22 +6294,22 @@
       </w:r>
       <w:r>
         <w:rPr>
+          <w:rFonts w:ascii="Arial" w:hAnsi="Arial" w:cs="Arial"/>
           <w:b/>
-          <w:rFonts w:ascii="Arial" w:hAnsi="Arial" w:cs="Arial"/>
         </w:rPr>
         <w:t xml:space="preserve">Transfers (Service Trucks) of </w:t>
       </w:r>
       <w:r>
         <w:rPr>
+          <w:rFonts w:ascii="Arial" w:hAnsi="Arial" w:cs="Arial"/>
           <w:b/>
-          <w:rFonts w:ascii="Arial" w:hAnsi="Arial" w:cs="Arial"/>
         </w:rPr>
         <w:t xml:space="preserve">1.613.953</w:t>
       </w:r>
       <w:r>
         <w:rPr>
+          <w:rFonts w:ascii="Arial" w:hAnsi="Arial" w:cs="Arial"/>
           <w:b/>
-          <w:rFonts w:ascii="Arial" w:hAnsi="Arial" w:cs="Arial"/>
         </w:rPr>
         <w:t xml:space="preserve"> L</w:t>
       </w:r>
@@ -6806,8 +6761,8 @@
       </w:r>
       <w:r>
         <w:rPr>
+          <w:rFonts w:ascii="Arial" w:hAnsi="Arial" w:cs="Arial"/>
           <w:b/>
-          <w:rFonts w:ascii="Arial" w:hAnsi="Arial" w:cs="Arial"/>
         </w:rPr>
         <w:t xml:space="preserve">Transaction:</w:t>
       </w:r>
@@ -6819,15 +6774,15 @@
       </w:r>
       <w:r>
         <w:rPr>
+          <w:rFonts w:ascii="Arial" w:hAnsi="Arial" w:cs="Arial"/>
           <w:b/>
-          <w:rFonts w:ascii="Arial" w:hAnsi="Arial" w:cs="Arial"/>
         </w:rPr>
         <w:t xml:space="preserve">899.784</w:t>
       </w:r>
       <w:r>
         <w:rPr>
+          <w:rFonts w:ascii="Arial" w:hAnsi="Arial" w:cs="Arial"/>
           <w:b/>
-          <w:rFonts w:ascii="Arial" w:hAnsi="Arial" w:cs="Arial"/>
         </w:rPr>
         <w:t xml:space="preserve"> L</w:t>
       </w:r>
@@ -6864,8 +6819,8 @@
       </w:r>
       <w:r>
         <w:rPr>
+          <w:rFonts w:ascii="Arial" w:hAnsi="Arial" w:cs="Arial"/>
           <w:b/>
-          <w:rFonts w:ascii="Arial" w:hAnsi="Arial" w:cs="Arial"/>
         </w:rPr>
         <w:t xml:space="preserve">To equipment:</w:t>
       </w:r>
@@ -6877,15 +6832,15 @@
       </w:r>
       <w:r>
         <w:rPr>
+          <w:rFonts w:ascii="Arial" w:hAnsi="Arial" w:cs="Arial"/>
           <w:b/>
-          <w:rFonts w:ascii="Arial" w:hAnsi="Arial" w:cs="Arial"/>
         </w:rPr>
         <w:t xml:space="preserve">556.250</w:t>
       </w:r>
       <w:r>
         <w:rPr>
+          <w:rFonts w:ascii="Arial" w:hAnsi="Arial" w:cs="Arial"/>
           <w:b/>
-          <w:rFonts w:ascii="Arial" w:hAnsi="Arial" w:cs="Arial"/>
         </w:rPr>
         <w:t xml:space="preserve"> L</w:t>
       </w:r>
@@ -6920,8 +6875,8 @@
       </w:r>
       <w:r>
         <w:rPr>
+          <w:rFonts w:ascii="Arial" w:hAnsi="Arial" w:cs="Arial"/>
           <w:b/>
-          <w:rFonts w:ascii="Arial" w:hAnsi="Arial" w:cs="Arial"/>
         </w:rPr>
         <w:t xml:space="preserve">Distribution of other Dispenses:</w:t>
       </w:r>
@@ -6933,15 +6888,15 @@
       </w:r>
       <w:r>
         <w:rPr>
+          <w:rFonts w:ascii="Arial" w:hAnsi="Arial" w:cs="Arial"/>
           <w:b/>
-          <w:rFonts w:ascii="Arial" w:hAnsi="Arial" w:cs="Arial"/>
         </w:rPr>
         <w:t xml:space="preserve">0</w:t>
       </w:r>
       <w:r>
         <w:rPr>
+          <w:rFonts w:ascii="Arial" w:hAnsi="Arial" w:cs="Arial"/>
           <w:b/>
-          <w:rFonts w:ascii="Arial" w:hAnsi="Arial" w:cs="Arial"/>
         </w:rPr>
         <w:t xml:space="preserve"> L</w:t>
       </w:r>
@@ -6976,8 +6931,8 @@
       </w:r>
       <w:r>
         <w:rPr>
+          <w:rFonts w:ascii="Arial" w:hAnsi="Arial" w:cs="Arial"/>
           <w:b/>
-          <w:rFonts w:ascii="Arial" w:hAnsi="Arial" w:cs="Arial"/>
         </w:rPr>
         <w:t xml:space="preserve">Distribution Transfers:</w:t>
       </w:r>
@@ -6989,15 +6944,15 @@
       </w:r>
       <w:r>
         <w:rPr>
+          <w:rFonts w:ascii="Arial" w:hAnsi="Arial" w:cs="Arial"/>
           <w:b/>
-          <w:rFonts w:ascii="Arial" w:hAnsi="Arial" w:cs="Arial"/>
         </w:rPr>
         <w:t xml:space="preserve">343.535</w:t>
       </w:r>
       <w:r>
         <w:rPr>
+          <w:rFonts w:ascii="Arial" w:hAnsi="Arial" w:cs="Arial"/>
           <w:b/>
-          <w:rFonts w:ascii="Arial" w:hAnsi="Arial" w:cs="Arial"/>
         </w:rPr>
         <w:t xml:space="preserve"> L</w:t>
       </w:r>
@@ -9193,7 +9148,6 @@
               <w:jc w:val="center"/>
               <w:rPr>
                 <w:noProof/>
-                <w14:ligatures w14:val="standardContextual"/>
               </w:rPr>
             </w:pPr>
             <w:r>
@@ -9706,7 +9660,6 @@
             <w:r>
               <w:rPr>
                 <w:noProof/>
-                <w14:ligatures w14:val="standardContextual"/>
               </w:rPr>
               <w:drawing>
                 <wp:inline distT="0" distB="0" distL="0" distR="0" wp14:anchorId="4CCDBDED" wp14:editId="221AA30F">
@@ -9887,13 +9840,11 @@
               <w:jc w:val="center"/>
               <w:rPr>
                 <w:noProof/>
-                <w14:ligatures w14:val="standardContextual"/>
               </w:rPr>
             </w:pPr>
             <w:r>
               <w:rPr>
                 <w:noProof/>
-                <w14:ligatures w14:val="standardContextual"/>
               </w:rPr>
               <w:lastRenderedPageBreak/>
               <w:drawing>
@@ -10051,13 +10002,11 @@
               <w:jc w:val="center"/>
               <w:rPr>
                 <w:noProof/>
-                <w14:ligatures w14:val="standardContextual"/>
               </w:rPr>
             </w:pPr>
             <w:r>
               <w:rPr>
                 <w:noProof/>
-                <w14:ligatures w14:val="standardContextual"/>
               </w:rPr>
               <w:drawing>
                 <wp:inline distT="0" distB="0" distL="0" distR="0" wp14:anchorId="2FDF79DD" wp14:editId="0ACBC2B7">
@@ -10214,13 +10163,11 @@
               <w:jc w:val="center"/>
               <w:rPr>
                 <w:noProof/>
-                <w14:ligatures w14:val="standardContextual"/>
               </w:rPr>
             </w:pPr>
             <w:r>
               <w:rPr>
                 <w:noProof/>
-                <w14:ligatures w14:val="standardContextual"/>
               </w:rPr>
               <w:lastRenderedPageBreak/>
               <w:drawing>
@@ -10378,13 +10325,11 @@
               <w:jc w:val="center"/>
               <w:rPr>
                 <w:noProof/>
-                <w14:ligatures w14:val="standardContextual"/>
               </w:rPr>
             </w:pPr>
             <w:r>
               <w:rPr>
                 <w:noProof/>
-                <w14:ligatures w14:val="standardContextual"/>
               </w:rPr>
               <w:drawing>
                 <wp:inline distT="0" distB="0" distL="0" distR="0" wp14:anchorId="2960D885" wp14:editId="035F3C1D">
@@ -10551,13 +10496,11 @@
               <w:jc w:val="both"/>
               <w:rPr>
                 <w:noProof/>
-                <w14:ligatures w14:val="standardContextual"/>
               </w:rPr>
             </w:pPr>
             <w:r>
               <w:rPr>
                 <w:noProof/>
-                <w14:ligatures w14:val="standardContextual"/>
               </w:rPr>
               <w:lastRenderedPageBreak/>
               <w:drawing>
@@ -10763,13 +10706,11 @@
               <w:jc w:val="both"/>
               <w:rPr>
                 <w:noProof/>
-                <w14:ligatures w14:val="standardContextual"/>
               </w:rPr>
             </w:pPr>
             <w:r>
               <w:rPr>
                 <w:noProof/>
-                <w14:ligatures w14:val="standardContextual"/>
               </w:rPr>
               <w:drawing>
                 <wp:inline distT="0" distB="0" distL="0" distR="0" wp14:anchorId="51D9188E" wp14:editId="1A5507AA">
@@ -10952,13 +10893,11 @@
               <w:jc w:val="both"/>
               <w:rPr>
                 <w:noProof/>
-                <w14:ligatures w14:val="standardContextual"/>
               </w:rPr>
             </w:pPr>
             <w:r>
               <w:rPr>
                 <w:noProof/>
-                <w14:ligatures w14:val="standardContextual"/>
               </w:rPr>
               <w:lastRenderedPageBreak/>
               <w:drawing>
@@ -11019,13 +10958,11 @@
               <w:textAlignment w:val="center"/>
               <w:rPr>
                 <w:noProof/>
-                <w14:ligatures w14:val="standardContextual"/>
               </w:rPr>
             </w:pPr>
             <w:r>
               <w:rPr>
                 <w:noProof/>
-                <w14:ligatures w14:val="standardContextual"/>
               </w:rPr>
               <w:t>Daily tank Pipe Line/Corrosion</w:t>
             </w:r>
@@ -11096,13 +11033,11 @@
               <w:jc w:val="both"/>
               <w:rPr>
                 <w:noProof/>
-                <w14:ligatures w14:val="standardContextual"/>
               </w:rPr>
             </w:pPr>
             <w:r>
               <w:rPr>
                 <w:noProof/>
-                <w14:ligatures w14:val="standardContextual"/>
               </w:rPr>
               <w:drawing>
                 <wp:inline distT="0" distB="0" distL="0" distR="0" wp14:anchorId="68211841" wp14:editId="653D473A">
@@ -11172,13 +11107,11 @@
               <w:textAlignment w:val="center"/>
               <w:rPr>
                 <w:noProof/>
-                <w14:ligatures w14:val="standardContextual"/>
               </w:rPr>
             </w:pPr>
             <w:r>
               <w:rPr>
                 <w:noProof/>
-                <w14:ligatures w14:val="standardContextual"/>
               </w:rPr>
               <w:t>Water inside the control panel LFO2</w:t>
             </w:r>
@@ -11657,88 +11590,71 @@
                     </wps:style>
                     <wps:txbx>
                       <w:txbxContent>
-                        <w:sdt>
-                          <w:sdtPr>
+                        <w:p>
+                          <w:pPr>
+                            <w:pStyle w:val="Header"/>
+                            <w:rPr>
+                              <w:caps/>
+                              <w:color w:val="FFFFFF" w:themeColor="background1"/>
+                            </w:rPr>
+                          </w:pPr>
+                          <w:r>
                             <w:rPr>
                               <w:b/>
                               <w:noProof/>
                               <w:color w:val="FFFFFF" w:themeColor="background1"/>
                               <w:sz w:val="32"/>
                             </w:rPr>
-                            <w:alias w:val="Title"/>
-                            <w:tag w:val=""/>
-                            <w:id w:val="1189017394"/>
-                            <w:dataBinding w:prefixMappings="xmlns:ns0='http://purl.org/dc/elements/1.1/' xmlns:ns1='http://schemas.openxmlformats.org/package/2006/metadata/core-properties' " w:xpath="/ns1:coreProperties[1]/ns0:title[1]" w:storeItemID="{6C3C8BC8-F283-45AE-878A-BAB7291924A1}"/>
-                            <w:text/>
-                          </w:sdtPr>
-                          <w:sdtContent>
-                            <w:p>
-                              <w:pPr>
-                                <w:pStyle w:val="Header"/>
-                                <w:rPr>
-                                  <w:caps/>
-                                  <w:color w:val="FFFFFF" w:themeColor="background1"/>
-                                </w:rPr>
-                              </w:pPr>
-                              <w:r>
-                                <w:rPr>
-                                  <w:b/>
-                                  <w:noProof/>
-                                  <w:color w:val="FFFFFF" w:themeColor="background1"/>
-                                  <w:sz w:val="32"/>
-                                </w:rPr>
-                                <w:drawing>
-                                  <wp:inline distT="0" distB="0" distL="0" distR="0" wp14:anchorId="03A97BC5" wp14:editId="387B2B6E">
-                                    <wp:extent cx="3337560" cy="266700"/>
-                                    <wp:effectExtent l="0" t="0" r="0" b="0"/>
-                                    <wp:docPr id="1750329699" name="Picture 12"/>
-                                    <wp:cNvGraphicFramePr>
-                                      <a:graphicFrameLocks xmlns:a="http://schemas.openxmlformats.org/drawingml/2006/main" noChangeAspect="1"/>
-                                    </wp:cNvGraphicFramePr>
-                                    <a:graphic xmlns:a="http://schemas.openxmlformats.org/drawingml/2006/main">
-                                      <a:graphicData uri="http://schemas.openxmlformats.org/drawingml/2006/picture">
-                                        <pic:pic xmlns:pic="http://schemas.openxmlformats.org/drawingml/2006/picture">
-                                          <pic:nvPicPr>
-                                            <pic:cNvPr id="0" name="Picture 1"/>
-                                            <pic:cNvPicPr>
-                                              <a:picLocks noChangeAspect="1" noChangeArrowheads="1"/>
-                                            </pic:cNvPicPr>
-                                          </pic:nvPicPr>
-                                          <pic:blipFill>
-                                            <a:blip r:embed="rId1">
-                                              <a:extLst>
-                                                <a:ext uri="{28A0092B-C50C-407E-A947-70E740481C1C}">
-                                                  <a14:useLocalDpi xmlns:a14="http://schemas.microsoft.com/office/drawing/2010/main" val="0"/>
-                                                </a:ext>
-                                              </a:extLst>
-                                            </a:blip>
-                                            <a:srcRect/>
-                                            <a:stretch>
-                                              <a:fillRect/>
-                                            </a:stretch>
-                                          </pic:blipFill>
-                                          <pic:spPr bwMode="auto">
-                                            <a:xfrm>
-                                              <a:off x="0" y="0"/>
-                                              <a:ext cx="3337560" cy="266700"/>
-                                            </a:xfrm>
-                                            <a:prstGeom prst="rect">
-                                              <a:avLst/>
-                                            </a:prstGeom>
-                                            <a:noFill/>
-                                            <a:ln>
-                                              <a:noFill/>
-                                            </a:ln>
-                                          </pic:spPr>
-                                        </pic:pic>
-                                      </a:graphicData>
-                                    </a:graphic>
-                                  </wp:inline>
-                                </w:drawing>
-                              </w:r>
-                            </w:p>
-                          </w:sdtContent>
-                        </w:sdt>
+                            <w:drawing>
+                              <wp:inline distT="0" distB="0" distL="0" distR="0" wp14:anchorId="03A97BC5" wp14:editId="387B2B6E">
+                                <wp:extent cx="3337560" cy="266700"/>
+                                <wp:effectExtent l="0" t="0" r="0" b="0"/>
+                                <wp:docPr id="1750329699" name="Picture 12"/>
+                                <wp:cNvGraphicFramePr>
+                                  <a:graphicFrameLocks noChangeAspect="1"/>
+                                </wp:cNvGraphicFramePr>
+                                <a:graphic>
+                                  <a:graphicData uri="http://schemas.openxmlformats.org/drawingml/2006/picture">
+                                    <pic:pic xmlns:pic="http://schemas.openxmlformats.org/drawingml/2006/picture">
+                                      <pic:nvPicPr>
+                                        <pic:cNvPr id="0" name="Picture 1"/>
+                                        <pic:cNvPicPr>
+                                          <a:picLocks noChangeAspect="1" noChangeArrowheads="1"/>
+                                        </pic:cNvPicPr>
+                                      </pic:nvPicPr>
+                                      <pic:blipFill>
+                                        <a:blip r:embed="rId1">
+                                          <a:extLst>
+                                            <a:ext uri="{28A0092B-C50C-407E-A947-70E740481C1C}">
+                                              <a14:useLocalDpi xmlns:a14="http://schemas.microsoft.com/office/drawing/2010/main" val="0"/>
+                                            </a:ext>
+                                          </a:extLst>
+                                        </a:blip>
+                                        <a:srcRect/>
+                                        <a:stretch>
+                                          <a:fillRect/>
+                                        </a:stretch>
+                                      </pic:blipFill>
+                                      <pic:spPr bwMode="auto">
+                                        <a:xfrm>
+                                          <a:off x="0" y="0"/>
+                                          <a:ext cx="3337560" cy="266700"/>
+                                        </a:xfrm>
+                                        <a:prstGeom prst="rect">
+                                          <a:avLst/>
+                                        </a:prstGeom>
+                                        <a:noFill/>
+                                        <a:ln>
+                                          <a:noFill/>
+                                        </a:ln>
+                                      </pic:spPr>
+                                    </pic:pic>
+                                  </a:graphicData>
+                                </a:graphic>
+                              </wp:inline>
+                            </w:drawing>
+                          </w:r>
+                        </w:p>
                       </w:txbxContent>
                     </wps:txbx>
                     <wps:bodyPr rot="0" spcFirstLastPara="0" vertOverflow="overflow" horzOverflow="overflow" vert="horz" wrap="square" lIns="91440" tIns="45720" rIns="91440" bIns="45720" numCol="1" spcCol="0" rtlCol="0" fromWordArt="0" anchor="ctr" anchorCtr="0" forceAA="0" compatLnSpc="1">
@@ -11764,88 +11680,71 @@
             <v:rect w14:anchorId="6036976B" id="Rectangle 200" o:spid="_x0000_s1028" style="position:absolute;margin-left:-70.8pt;margin-top:1.8pt;width:609pt;height:52.2pt;z-index:-251664896;visibility:visible;mso-wrap-style:square;mso-width-percent:0;mso-height-percent:0;mso-wrap-distance-left:9.35pt;mso-wrap-distance-top:0;mso-wrap-distance-right:9.35pt;mso-wrap-distance-bottom:0;mso-position-horizontal:absolute;mso-position-horizontal-relative:margin;mso-position-vertical:absolute;mso-position-vertical-relative:page;mso-width-percent:0;mso-height-percent:0;mso-width-relative:margin;mso-height-relative:page;v-text-anchor:middle" o:gfxdata="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" o:allowoverlap="f" fillcolor="#156082 [3204]" stroked="f" strokeweight="1pt">
               <v:textbox>
                 <w:txbxContent>
-                  <w:sdt>
-                    <w:sdtPr>
+                  <w:p>
+                    <w:pPr>
+                      <w:pStyle w:val="Header"/>
+                      <w:rPr>
+                        <w:caps/>
+                        <w:color w:val="FFFFFF" w:themeColor="background1"/>
+                      </w:rPr>
+                    </w:pPr>
+                    <w:r>
                       <w:rPr>
                         <w:b/>
                         <w:noProof/>
                         <w:color w:val="FFFFFF" w:themeColor="background1"/>
                         <w:sz w:val="32"/>
                       </w:rPr>
-                      <w:alias w:val="Title"/>
-                      <w:tag w:val=""/>
-                      <w:id w:val="1189017394"/>
-                      <w:dataBinding w:prefixMappings="xmlns:ns0='http://purl.org/dc/elements/1.1/' xmlns:ns1='http://schemas.openxmlformats.org/package/2006/metadata/core-properties' " w:xpath="/ns1:coreProperties[1]/ns0:title[1]" w:storeItemID="{6C3C8BC8-F283-45AE-878A-BAB7291924A1}"/>
-                      <w:text/>
-                    </w:sdtPr>
-                    <w:sdtContent>
-                      <w:p>
-                        <w:pPr>
-                          <w:pStyle w:val="Header"/>
-                          <w:rPr>
-                            <w:caps/>
-                            <w:color w:val="FFFFFF" w:themeColor="background1"/>
-                          </w:rPr>
-                        </w:pPr>
-                        <w:r>
-                          <w:rPr>
-                            <w:b/>
-                            <w:noProof/>
-                            <w:color w:val="FFFFFF" w:themeColor="background1"/>
-                            <w:sz w:val="32"/>
-                          </w:rPr>
-                          <w:drawing>
-                            <wp:inline distT="0" distB="0" distL="0" distR="0" wp14:anchorId="03A97BC5" wp14:editId="387B2B6E">
-                              <wp:extent cx="3337560" cy="266700"/>
-                              <wp:effectExtent l="0" t="0" r="0" b="0"/>
-                              <wp:docPr id="1750329699" name="Picture 12"/>
-                              <wp:cNvGraphicFramePr>
-                                <a:graphicFrameLocks xmlns:a="http://schemas.openxmlformats.org/drawingml/2006/main" noChangeAspect="1"/>
-                              </wp:cNvGraphicFramePr>
-                              <a:graphic xmlns:a="http://schemas.openxmlformats.org/drawingml/2006/main">
-                                <a:graphicData uri="http://schemas.openxmlformats.org/drawingml/2006/picture">
-                                  <pic:pic xmlns:pic="http://schemas.openxmlformats.org/drawingml/2006/picture">
-                                    <pic:nvPicPr>
-                                      <pic:cNvPr id="0" name="Picture 1"/>
-                                      <pic:cNvPicPr>
-                                        <a:picLocks noChangeAspect="1" noChangeArrowheads="1"/>
-                                      </pic:cNvPicPr>
-                                    </pic:nvPicPr>
-                                    <pic:blipFill>
-                                      <a:blip r:embed="rId1">
-                                        <a:extLst>
-                                          <a:ext uri="{28A0092B-C50C-407E-A947-70E740481C1C}">
-                                            <a14:useLocalDpi xmlns:a14="http://schemas.microsoft.com/office/drawing/2010/main" val="0"/>
-                                          </a:ext>
-                                        </a:extLst>
-                                      </a:blip>
-                                      <a:srcRect/>
-                                      <a:stretch>
-                                        <a:fillRect/>
-                                      </a:stretch>
-                                    </pic:blipFill>
-                                    <pic:spPr bwMode="auto">
-                                      <a:xfrm>
-                                        <a:off x="0" y="0"/>
-                                        <a:ext cx="3337560" cy="266700"/>
-                                      </a:xfrm>
-                                      <a:prstGeom prst="rect">
-                                        <a:avLst/>
-                                      </a:prstGeom>
-                                      <a:noFill/>
-                                      <a:ln>
-                                        <a:noFill/>
-                                      </a:ln>
-                                    </pic:spPr>
-                                  </pic:pic>
-                                </a:graphicData>
-                              </a:graphic>
-                            </wp:inline>
-                          </w:drawing>
-                        </w:r>
-                      </w:p>
-                    </w:sdtContent>
-                  </w:sdt>
+                      <w:drawing>
+                        <wp:inline distT="0" distB="0" distL="0" distR="0" wp14:anchorId="03A97BC5" wp14:editId="387B2B6E">
+                          <wp:extent cx="3337560" cy="266700"/>
+                          <wp:effectExtent l="0" t="0" r="0" b="0"/>
+                          <wp:docPr id="1750329699" name="Picture 12"/>
+                          <wp:cNvGraphicFramePr>
+                            <a:graphicFrameLocks xmlns:a="http://schemas.openxmlformats.org/drawingml/2006/main" noChangeAspect="1"/>
+                          </wp:cNvGraphicFramePr>
+                          <a:graphic xmlns:a="http://schemas.openxmlformats.org/drawingml/2006/main">
+                            <a:graphicData uri="http://schemas.openxmlformats.org/drawingml/2006/picture">
+                              <pic:pic xmlns:pic="http://schemas.openxmlformats.org/drawingml/2006/picture">
+                                <pic:nvPicPr>
+                                  <pic:cNvPr id="0" name="Picture 1"/>
+                                  <pic:cNvPicPr>
+                                    <a:picLocks noChangeAspect="1" noChangeArrowheads="1"/>
+                                  </pic:cNvPicPr>
+                                </pic:nvPicPr>
+                                <pic:blipFill>
+                                  <a:blip r:embed="rId1">
+                                    <a:extLst>
+                                      <a:ext uri="{28A0092B-C50C-407E-A947-70E740481C1C}">
+                                        <a14:useLocalDpi xmlns:a14="http://schemas.microsoft.com/office/drawing/2010/main" val="0"/>
+                                      </a:ext>
+                                    </a:extLst>
+                                  </a:blip>
+                                  <a:srcRect/>
+                                  <a:stretch>
+                                    <a:fillRect/>
+                                  </a:stretch>
+                                </pic:blipFill>
+                                <pic:spPr bwMode="auto">
+                                  <a:xfrm>
+                                    <a:off x="0" y="0"/>
+                                    <a:ext cx="3337560" cy="266700"/>
+                                  </a:xfrm>
+                                  <a:prstGeom prst="rect">
+                                    <a:avLst/>
+                                  </a:prstGeom>
+                                  <a:noFill/>
+                                  <a:ln>
+                                    <a:noFill/>
+                                  </a:ln>
+                                </pic:spPr>
+                              </pic:pic>
+                            </a:graphicData>
+                          </a:graphic>
+                        </wp:inline>
+                      </w:drawing>
+                    </w:r>
+                  </w:p>
                 </w:txbxContent>
               </v:textbox>
               <w10:wrap type="square" anchorx="margin" anchory="page"/>

</xml_diff>